<commit_message>
Prepare submission candidate with baseline audit, window metric and author identifiers
</commit_message>
<xml_diff>
--- a/paper/Title_Page_and_Declarations.docx
+++ b/paper/Title_Page_and_Declarations.docx
@@ -31,6 +31,14 @@
         <w:t>* Corresponding author: Decong Yang</w:t>
         <w:br/>
         <w:t>Email: 20232501525@stu.xju.edu.cn</w:t>
+      </w:r>
+    </w:p>
+    <w:p>
+      <w:r>
+        <w:rPr>
+          <w:rFonts w:ascii="Times New Roman" w:hAnsi="Times New Roman"/>
+        </w:rPr>
+        <w:t>ORCID: Xin Feng — 0009-0008-3242-7961; Decong Yang — 0009-0009-9295-5149</w:t>
       </w:r>
     </w:p>
     <w:p>

</xml_diff>

<commit_message>
Revise narrative for IJAR with frozen PAA evidence
</commit_message>
<xml_diff>
--- a/paper/Title_Page_and_Declarations.docx
+++ b/paper/Title_Page_and_Declarations.docx
@@ -10,7 +10,7 @@
         <w:rPr>
           <w:rFonts w:ascii="Times New Roman" w:hAnsi="Times New Roman"/>
         </w:rPr>
-        <w:t>Label-efficient emulation of conformal reference sets for wearable activity recognition</w:t>
+        <w:t>Sequential reference preservation for label-efficient set-valued prediction</w:t>
       </w:r>
     </w:p>
     <w:p>
@@ -49,7 +49,7 @@
         <w:rPr>
           <w:rFonts w:ascii="Times New Roman" w:hAnsi="Times New Roman"/>
         </w:rPr>
-        <w:t>Statements and Declarations</w:t>
+        <w:t>Author statements</w:t>
       </w:r>
     </w:p>
     <w:p>
@@ -98,7 +98,7 @@
         <w:rPr>
           <w:rFonts w:ascii="Times New Roman" w:hAnsi="Times New Roman"/>
         </w:rPr>
-        <w:t>Author contributions</w:t>
+        <w:t>CRediT authorship contribution statement</w:t>
       </w:r>
     </w:p>
     <w:p>
@@ -106,7 +106,7 @@
         <w:rPr>
           <w:rFonts w:ascii="Times New Roman" w:hAnsi="Times New Roman"/>
         </w:rPr>
-        <w:t>Xin Feng: study design, methodology, software, data curation, experiments, formal analysis and original draft preparation. Decong Yang: figure preparation and revision, critical manuscript review and language editing.</w:t>
+        <w:t>Xin Feng: Conceptualization, Methodology, Software, Data curation, Formal analysis, Investigation, Writing - original draft. Decong Yang: Visualization, Writing - review and editing.</w:t>
       </w:r>
     </w:p>
     <w:p>
@@ -125,7 +125,7 @@
         <w:rPr>
           <w:rFonts w:ascii="Times New Roman" w:hAnsi="Times New Roman"/>
         </w:rPr>
-        <w:t>The study uses public activity-recognition datasets cited in the manuscript. Code and reproduction instructions are available at https://github.com/Cyrano666/jrc-reference-emulation. Online Resource 1 contains frozen predictions, evaluation tables and protocol records.</w:t>
+        <w:t>The study uses the eight public activity-recognition datasets cited in the manuscript. Code and reproduction instructions are available at https://github.com/Cyrano666/jrc-reference-emulation. Supplementary material 1 contains the frozen predictions, result tables, protocols and verification records for the reported experiments.</w:t>
       </w:r>
     </w:p>
     <w:p>

</xml_diff>

<commit_message>
Foreground acquisition contributions and apply IJAR author guidance
</commit_message>
<xml_diff>
--- a/paper/Title_Page_and_Declarations.docx
+++ b/paper/Title_Page_and_Declarations.docx
@@ -17,16 +17,61 @@
       <w:r>
         <w:rPr>
           <w:rFonts w:ascii="Times New Roman" w:hAnsi="Times New Roman"/>
+          <w:b w:val="0"/>
+          <w:color w:val="000000"/>
+          <w:sz w:val="22"/>
         </w:rPr>
-        <w:t>Xin Feng¹ and Decong Yang¹*</w:t>
+        <w:t>Xin Feng</w:t>
+      </w:r>
+      <w:r>
+        <w:rPr>
+          <w:rFonts w:ascii="Times New Roman" w:hAnsi="Times New Roman"/>
+          <w:b w:val="0"/>
+          <w:color w:val="000000"/>
+          <w:sz w:val="22"/>
+          <w:vertAlign w:val="superscript"/>
+        </w:rPr>
+        <w:t>a</w:t>
+      </w:r>
+      <w:r>
+        <w:rPr>
+          <w:rFonts w:ascii="Times New Roman" w:hAnsi="Times New Roman"/>
+          <w:b w:val="0"/>
+          <w:color w:val="000000"/>
+          <w:sz w:val="22"/>
+        </w:rPr>
+        <w:t xml:space="preserve"> and Decong Yang</w:t>
+      </w:r>
+      <w:r>
+        <w:rPr>
+          <w:rFonts w:ascii="Times New Roman" w:hAnsi="Times New Roman"/>
+          <w:b w:val="0"/>
+          <w:color w:val="000000"/>
+          <w:sz w:val="22"/>
+          <w:vertAlign w:val="superscript"/>
+        </w:rPr>
+        <w:t>a,*</w:t>
       </w:r>
     </w:p>
     <w:p>
       <w:r>
         <w:rPr>
           <w:rFonts w:ascii="Times New Roman" w:hAnsi="Times New Roman"/>
+          <w:b w:val="0"/>
+          <w:color w:val="000000"/>
+          <w:sz w:val="22"/>
+          <w:vertAlign w:val="superscript"/>
         </w:rPr>
-        <w:t>¹ Xinjiang University, Urumqi, China</w:t>
+        <w:t>a</w:t>
+      </w:r>
+      <w:r>
+        <w:rPr>
+          <w:rFonts w:ascii="Times New Roman" w:hAnsi="Times New Roman"/>
+          <w:b w:val="0"/>
+          <w:color w:val="000000"/>
+          <w:sz w:val="22"/>
+        </w:rPr>
+        <w:t xml:space="preserve"> Xinjiang University, Youhao Campus, 499 Xibei Road, Shayibake District, Urumqi, Xinjiang 830091, China</w:t>
         <w:br/>
         <w:t>* Corresponding author: Decong Yang</w:t>
         <w:br/>
@@ -67,8 +112,11 @@
       <w:r>
         <w:rPr>
           <w:rFonts w:ascii="Times New Roman" w:hAnsi="Times New Roman"/>
+          <w:b w:val="0"/>
+          <w:color w:val="000000"/>
+          <w:sz w:val="22"/>
         </w:rPr>
-        <w:t>The authors received no specific funding for this study.</w:t>
+        <w:t>This research did not receive any specific grant from funding agencies in the public, commercial, or not-for-profit sectors.</w:t>
       </w:r>
     </w:p>
     <w:p>
@@ -86,8 +134,11 @@
       <w:r>
         <w:rPr>
           <w:rFonts w:ascii="Times New Roman" w:hAnsi="Times New Roman"/>
+          <w:b w:val="0"/>
+          <w:color w:val="000000"/>
+          <w:sz w:val="22"/>
         </w:rPr>
-        <w:t>The authors declare no competing interests relevant to this study.</w:t>
+        <w:t>The authors declare that they have no known competing financial interests or personal relationships that could have appeared to influence the work reported in this paper.</w:t>
       </w:r>
     </w:p>
     <w:p>
@@ -124,8 +175,11 @@
       <w:r>
         <w:rPr>
           <w:rFonts w:ascii="Times New Roman" w:hAnsi="Times New Roman"/>
+          <w:b w:val="0"/>
+          <w:color w:val="000000"/>
+          <w:sz w:val="22"/>
         </w:rPr>
-        <w:t>The study uses the eight public activity-recognition datasets cited in the manuscript. Code and reproduction instructions are available at https://github.com/Cyrano666/jrc-reference-emulation. Supplementary material 1 contains the frozen predictions, result tables, protocols and verification records for the reported experiments.</w:t>
+        <w:t>The eight source datasets are available from the providers cited in the manuscript. The frozen numerical records and implementation are available at https://github.com/Cyrano666/jrc-reference-emulation/releases/tag/submission-ready-2026-09-17. Supplementary material 1 contains the same scientific records and reproduction instructions.</w:t>
       </w:r>
     </w:p>
     <w:p>

</xml_diff>